<commit_message>
Update publications, projects, homepage layout, and cv.docx
- Fix author names for We Want to Dance book (full English names)
- North Korea projects → Humanitarian Assistance badge
- Home page: bio + research areas only (remove duplicate publications)
- Research page: all academic content
- cv.docx: remove address/phone, add KOICA 19.5/20 achievement,
  add book/WIP/under review labels, full author names

Co-Authored-By: Claude Sonnet 4.6 <noreply@anthropic.com>
</commit_message>
<xml_diff>
--- a/public/cv.docx
+++ b/public/cv.docx
@@ -55,12 +55,12 @@
     </w:p>
     <w:p>
       <w:r>
-        <w:t>Field Project Manager, Asian Dignity Initiative (ADI), Cox's Bazar, Bangladesh, 2022–2025</w:t>
+        <w:t>Field Project Manager, Asian Dignity Initiative (ADI), Cox's Bazar, Bangladesh, 2022–2025. KOICA External Evaluation: 19.5/20, Grade A (Highly Successful).</w:t>
       </w:r>
     </w:p>
     <w:p>
       <w:r>
-        <w:t>M&amp;E Officer, Asian Dignity Initiative (ADI), Seoul, ROK, 2021–2021</w:t>
+        <w:t>M&amp;E Officer, Asian Dignity Initiative (ADI), Seoul, ROK, 2021</w:t>
       </w:r>
     </w:p>
     <w:p>
@@ -100,28 +100,52 @@
       </w:r>
     </w:p>
     <w:p>
+      <w:pPr>
+        <w:pStyle w:val="Heading2"/>
+      </w:pPr>
       <w:r>
-        <w:t>Kong, Seonju, Seungji Lee, Young Hoon Song, and Sanghoon Park. 2025. "Motivations for Humanitarian Assistance Activists’ Participation in Public Education in South Korea." Korean Journal of International Migration 12(2): 147–174.</w:t>
+        <w:t>Peer-Reviewed Articles</w:t>
       </w:r>
     </w:p>
     <w:p>
       <w:r>
-        <w:t>Lee, S., Kong, S., Jeon, S., Oro, M., &amp; Lee, Y. 2024. "We Want to Dance But Our Houses Are Too Small: The Story of Shanti-Khana, A Women's Community Space in a Rohingya Refugee Camp."</w:t>
+        <w:t>Kong, Seonju, Seungji Lee, Young Hoon Song, and Sanghoon Park. 2025. “Motivations for Humanitarian Assistance Activists’ Participation in Public Education in South Korea.” Korean Journal of International Migration 12(2): 147–174. Published in Korean.</w:t>
+      </w:r>
+    </w:p>
+    <w:p>
+      <w:pPr>
+        <w:pStyle w:val="Heading2"/>
+      </w:pPr>
+      <w:r>
+        <w:t>Books</w:t>
       </w:r>
     </w:p>
     <w:p>
       <w:r>
-        <w:t>Asian Dignity Initiative. 2024. "Psychosocial Support Project for Rohingya and Host Community Women; Resilience Building, Phase 5 (2022–2024) – Baseline Assessment Report, Project Evaluation Report." ReliefWeb.</w:t>
+        <w:t>Lee, Seungji, Seonju Kong, Solbi Jeon, Minkyung Oro, and Yukyung Lee. 2024. We Want to Dance But Our Houses Are Too Small: The Story of Shanti-Khana, A Women’s Community Space in a Rohingya Refugee Camp. Asian Dignity Initiative.</w:t>
+      </w:r>
+    </w:p>
+    <w:p>
+      <w:pPr>
+        <w:pStyle w:val="Heading2"/>
+      </w:pPr>
+      <w:r>
+        <w:t>Reports</w:t>
       </w:r>
     </w:p>
     <w:p>
       <w:r>
-        <w:t>Asian Dignity Initiative. 2024. "Operations Manual of Multipurpose Women's Healing Center (MWHC) in Rohingya Refugee Camps." ReliefWeb.</w:t>
+        <w:t>Asian Dignity Initiative. 2024. “Psychosocial Support Project for Rohingya and Host Community Women; Resilience Building, Phase 5 (2022–2024) – Baseline Assessment Report, Project Evaluation Report.” ReliefWeb. Contributing author.</w:t>
       </w:r>
     </w:p>
     <w:p>
       <w:r>
-        <w:t>Asian Dignity Initiative. 2021. "Stories from Shanti Khana." ReliefWeb.</w:t>
+        <w:t>Asian Dignity Initiative. 2024. “Operations Manual of Multipurpose Women’s Healing Center (MWHC) in Rohingya Refugee Camps.” ReliefWeb. Contributing author.</w:t>
+      </w:r>
+    </w:p>
+    <w:p>
+      <w:r>
+        <w:t>Asian Dignity Initiative. 2021. “Stories from Shanti Khana.” ReliefWeb. Contributing author.</w:t>
       </w:r>
     </w:p>
     <w:p>
@@ -134,7 +158,7 @@
     </w:p>
     <w:p>
       <w:r>
-        <w:t>"Thriving in Confinement: What Enables Rohingya Refugee Women's Economic Empowerment in Cox's Bazar." Lee, Seungji, Sanghoon Park, Yoojin Lim, and Young Hoon Song. 2025. Under review.</w:t>
+        <w:t>Lee, Seungji, Sanghoon Park, Yoojin Lim, and Young Hoon Song. 2025. “Thriving in Confinement: What Enables Rohingya Refugee Women’s Economic Empowerment in Cox’s Bazar.” Under review.</w:t>
       </w:r>
     </w:p>
     <w:p>
@@ -168,6 +192,24 @@
     <w:p>
       <w:r>
         <w:t>Project Cycle Management Training, IOM, 2018</w:t>
+      </w:r>
+    </w:p>
+    <w:p>
+      <w:pPr>
+        <w:pStyle w:val="Heading1"/>
+      </w:pPr>
+      <w:r>
+        <w:t>Skills and Languages</w:t>
+      </w:r>
+    </w:p>
+    <w:p>
+      <w:r>
+        <w:t>Skills: Research and Analysis (STATA, R), Project Management (PCM), Stakeholder Management</w:t>
+      </w:r>
+    </w:p>
+    <w:p>
+      <w:r>
+        <w:t>Languages: Korean (Native), English (Fluent), Bengali (Basic)</w:t>
       </w:r>
     </w:p>
     <w:sectPr>

</xml_diff>